<commit_message>
Update repository with EV Dashboard, PCB project, and README improvements
</commit_message>
<xml_diff>
--- a/HOME_AUTOMATION_ESP32/docs/ESP32 Report.docx
+++ b/HOME_AUTOMATION_ESP32/docs/ESP32 Report.docx
@@ -4,6 +4,22 @@
   <w:body>
     <w:p>
       <w:pPr>
+        <w:pStyle w:val="Heading1"/>
+        <w:rPr>
+          <w:sz w:val="28"/>
+          <w:szCs w:val="28"/>
+        </w:rPr>
+      </w:pPr>
+      <w:r>
+        <w:rPr>
+          <w:sz w:val="28"/>
+          <w:szCs w:val="28"/>
+        </w:rPr>
+        <w:t xml:space="preserve">GAYATRI VIDYA PARISHAD COLLEGE FOR DEGREE AND PG COURSES (A) </w:t>
+      </w:r>
+    </w:p>
+    <w:p>
+      <w:pPr>
         <w:spacing w:after="59"/>
         <w:ind w:left="1479" w:right="53"/>
       </w:pPr>
@@ -38,15 +54,15 @@
         <w:ind w:left="1479" w:right="53"/>
       </w:pPr>
       <w:r>
-        <w:t xml:space="preserve">                                  </w:t>
+        <w:t xml:space="preserve">                        </w:t>
       </w:r>
       <w:r>
         <w:rPr>
           <w:noProof/>
         </w:rPr>
         <w:drawing>
-          <wp:inline distT="0" distB="0" distL="0" distR="0" wp14:anchorId="6B1ED091" wp14:editId="776D4D3F">
-            <wp:extent cx="2256790" cy="2209800"/>
+          <wp:inline distT="0" distB="0" distL="0" distR="0" wp14:anchorId="6B1ED091" wp14:editId="2EF55632">
+            <wp:extent cx="2827020" cy="2712720"/>
             <wp:effectExtent l="0" t="0" r="0" b="0"/>
             <wp:docPr id="74" name="Picture 74"/>
             <wp:cNvGraphicFramePr/>
@@ -66,7 +82,7 @@
                   <pic:spPr>
                     <a:xfrm>
                       <a:off x="0" y="0"/>
-                      <a:ext cx="2274324" cy="2226969"/>
+                      <a:ext cx="2848990" cy="2733802"/>
                     </a:xfrm>
                     <a:prstGeom prst="rect">
                       <a:avLst/>
@@ -114,94 +130,131 @@
         <w:spacing w:after="59"/>
         <w:ind w:left="1479" w:right="53"/>
       </w:pPr>
-      <w:r>
+    </w:p>
+    <w:p>
+      <w:pPr>
+        <w:spacing w:after="59"/>
+        <w:ind w:left="1479" w:right="53"/>
+      </w:pPr>
+    </w:p>
+    <w:p>
+      <w:pPr>
+        <w:spacing w:after="59"/>
+        <w:ind w:left="567" w:right="53" w:firstLine="0"/>
+      </w:pPr>
+    </w:p>
+    <w:p>
+      <w:pPr>
+        <w:spacing w:after="59"/>
+        <w:ind w:left="1479" w:right="53"/>
+      </w:pPr>
+    </w:p>
+    <w:p>
+      <w:pPr>
+        <w:spacing w:after="59"/>
+        <w:ind w:left="1479" w:right="53"/>
+      </w:pPr>
+    </w:p>
+    <w:p>
+      <w:pPr>
+        <w:spacing w:after="59"/>
+        <w:ind w:left="1479" w:right="53"/>
+      </w:pPr>
+    </w:p>
+    <w:p>
+      <w:pPr>
+        <w:spacing w:after="59"/>
+        <w:ind w:left="-142" w:right="27" w:firstLine="0"/>
+        <w:jc w:val="center"/>
+        <w:rPr>
+          <w:sz w:val="28"/>
+          <w:szCs w:val="28"/>
+        </w:rPr>
+      </w:pPr>
+      <w:r>
+        <w:rPr>
+          <w:sz w:val="28"/>
+          <w:szCs w:val="28"/>
+        </w:rPr>
         <w:t>GAYATRI VIDYA PARISHAD COLLEGE FOR DEGREE AND PG COURSES (A)</w:t>
       </w:r>
-      <w:r>
+    </w:p>
+    <w:p>
+      <w:pPr>
+        <w:spacing w:after="68"/>
+        <w:ind w:left="-142" w:right="27" w:firstLine="0"/>
+        <w:jc w:val="center"/>
         <w:rPr>
-          <w:sz w:val="22"/>
+          <w:sz w:val="28"/>
+          <w:szCs w:val="28"/>
         </w:rPr>
-        <w:t xml:space="preserve"> </w:t>
-      </w:r>
-    </w:p>
-    <w:p>
-      <w:pPr>
-        <w:spacing w:after="68"/>
-        <w:ind w:left="1667" w:right="53"/>
-      </w:pPr>
-      <w:r>
+      </w:pPr>
+      <w:r>
+        <w:rPr>
+          <w:sz w:val="28"/>
+          <w:szCs w:val="28"/>
+        </w:rPr>
         <w:t>DEPARTMENT OF ELECTRONICS &amp; COMMUNICATION ENGINEERING</w:t>
       </w:r>
-      <w:r>
+    </w:p>
+    <w:p>
+      <w:pPr>
+        <w:spacing w:after="57" w:line="259" w:lineRule="auto"/>
+        <w:ind w:left="-142" w:right="27" w:firstLine="0"/>
+        <w:jc w:val="center"/>
         <w:rPr>
-          <w:sz w:val="22"/>
+          <w:sz w:val="28"/>
+          <w:szCs w:val="28"/>
         </w:rPr>
-        <w:t xml:space="preserve"> </w:t>
-      </w:r>
-    </w:p>
-    <w:p>
-      <w:pPr>
-        <w:spacing w:after="57" w:line="259" w:lineRule="auto"/>
-        <w:ind w:left="724" w:firstLine="0"/>
-        <w:jc w:val="center"/>
       </w:pPr>
       <w:r>
         <w:rPr>
-          <w:sz w:val="26"/>
+          <w:sz w:val="28"/>
+          <w:szCs w:val="28"/>
         </w:rPr>
         <w:t>ENGINEERING &amp; TECHNOLOGY PROGRAM</w:t>
       </w:r>
-      <w:r>
+    </w:p>
+    <w:p>
+      <w:pPr>
+        <w:ind w:left="-142" w:right="27" w:firstLine="0"/>
+        <w:jc w:val="center"/>
         <w:rPr>
-          <w:sz w:val="22"/>
+          <w:sz w:val="28"/>
+          <w:szCs w:val="28"/>
         </w:rPr>
-        <w:t xml:space="preserve"> </w:t>
-      </w:r>
-    </w:p>
-    <w:p>
-      <w:pPr>
-        <w:ind w:left="1532" w:right="53"/>
-      </w:pPr>
-      <w:r>
+      </w:pPr>
+      <w:r>
+        <w:rPr>
+          <w:sz w:val="28"/>
+          <w:szCs w:val="28"/>
+        </w:rPr>
         <w:t xml:space="preserve">Rushikonda, Visakhapatnam-530 045 | website: </w:t>
       </w:r>
       <w:r>
         <w:rPr>
+          <w:sz w:val="28"/>
+          <w:szCs w:val="28"/>
           <w:u w:val="single" w:color="000000"/>
         </w:rPr>
         <w:t>www.gvpcdpgc.edu.in</w:t>
       </w:r>
-      <w:r>
+    </w:p>
+    <w:p>
+      <w:pPr>
+        <w:ind w:left="-142" w:right="27" w:firstLine="0"/>
+        <w:jc w:val="center"/>
         <w:rPr>
-          <w:sz w:val="22"/>
+          <w:sz w:val="28"/>
+          <w:szCs w:val="28"/>
         </w:rPr>
-        <w:t xml:space="preserve"> </w:t>
-      </w:r>
-    </w:p>
-    <w:p>
-      <w:pPr>
-        <w:ind w:left="-5" w:right="53"/>
-      </w:pPr>
-      <w:r>
-        <w:t xml:space="preserve">          (Approved by AICTE I Affiliated to Andhra University I Accredited by NAAC I ISO</w:t>
-      </w:r>
+      </w:pPr>
       <w:r>
         <w:rPr>
-          <w:sz w:val="22"/>
+          <w:sz w:val="28"/>
+          <w:szCs w:val="28"/>
         </w:rPr>
-        <w:t xml:space="preserve"> </w:t>
-      </w:r>
-      <w:r>
-        <w:t xml:space="preserve">9001:2015) </w:t>
-      </w:r>
-    </w:p>
-    <w:p>
-      <w:pPr>
-        <w:spacing w:after="11" w:line="259" w:lineRule="auto"/>
-        <w:ind w:left="0" w:firstLine="0"/>
-      </w:pPr>
-      <w:r>
-        <w:t xml:space="preserve"> </w:t>
+        <w:t>(Approved by AICTE I Affiliated to Andhra University I Accredited by NAAC I ISO 9001:2015)</w:t>
       </w:r>
     </w:p>
     <w:p>
@@ -209,82 +262,10 @@
         <w:spacing w:line="259" w:lineRule="auto"/>
         <w:ind w:left="0" w:firstLine="0"/>
       </w:pPr>
-      <w:r>
-        <w:t xml:space="preserve"> </w:t>
-      </w:r>
     </w:p>
     <w:p>
       <w:pPr>
         <w:spacing w:line="259" w:lineRule="auto"/>
-        <w:ind w:left="0" w:firstLine="0"/>
-      </w:pPr>
-      <w:r>
-        <w:t xml:space="preserve"> </w:t>
-      </w:r>
-    </w:p>
-    <w:p>
-      <w:pPr>
-        <w:spacing w:after="0" w:line="259" w:lineRule="auto"/>
-        <w:ind w:left="0" w:firstLine="0"/>
-      </w:pPr>
-    </w:p>
-    <w:p>
-      <w:pPr>
-        <w:spacing w:after="0" w:line="259" w:lineRule="auto"/>
-        <w:ind w:left="0" w:firstLine="0"/>
-      </w:pPr>
-    </w:p>
-    <w:p>
-      <w:pPr>
-        <w:spacing w:after="0" w:line="259" w:lineRule="auto"/>
-        <w:ind w:left="0" w:firstLine="0"/>
-      </w:pPr>
-    </w:p>
-    <w:p>
-      <w:pPr>
-        <w:spacing w:after="0" w:line="259" w:lineRule="auto"/>
-        <w:ind w:left="0" w:firstLine="0"/>
-      </w:pPr>
-    </w:p>
-    <w:p>
-      <w:pPr>
-        <w:spacing w:after="0" w:line="259" w:lineRule="auto"/>
-        <w:ind w:left="0" w:firstLine="0"/>
-      </w:pPr>
-    </w:p>
-    <w:p>
-      <w:pPr>
-        <w:spacing w:after="0" w:line="259" w:lineRule="auto"/>
-        <w:ind w:left="0" w:firstLine="0"/>
-      </w:pPr>
-    </w:p>
-    <w:p>
-      <w:pPr>
-        <w:spacing w:after="0" w:line="259" w:lineRule="auto"/>
-        <w:ind w:left="0" w:firstLine="0"/>
-      </w:pPr>
-    </w:p>
-    <w:p>
-      <w:pPr>
-        <w:spacing w:after="0" w:line="259" w:lineRule="auto"/>
-        <w:ind w:left="0" w:firstLine="0"/>
-      </w:pPr>
-    </w:p>
-    <w:p>
-      <w:pPr>
-        <w:spacing w:after="0" w:line="259" w:lineRule="auto"/>
-        <w:ind w:left="0" w:firstLine="0"/>
-      </w:pPr>
-    </w:p>
-    <w:p>
-      <w:pPr>
-        <w:spacing w:after="0" w:line="259" w:lineRule="auto"/>
-        <w:ind w:left="0" w:firstLine="0"/>
-      </w:pPr>
-    </w:p>
-    <w:p>
-      <w:pPr>
-        <w:spacing w:after="0" w:line="259" w:lineRule="auto"/>
         <w:ind w:left="0" w:firstLine="0"/>
       </w:pPr>
     </w:p>
@@ -458,19 +439,6 @@
     </w:p>
     <w:p>
       <w:pPr>
-        <w:spacing w:after="137" w:line="259" w:lineRule="auto"/>
-        <w:ind w:left="0" w:firstLine="0"/>
-      </w:pPr>
-      <w:r>
-        <w:rPr>
-          <w:b/>
-          <w:sz w:val="22"/>
-        </w:rPr>
-        <w:t xml:space="preserve"> </w:t>
-      </w:r>
-    </w:p>
-    <w:p>
-      <w:pPr>
         <w:numPr>
           <w:ilvl w:val="0"/>
           <w:numId w:val="3"/>
@@ -505,27 +473,15 @@
       <w:r>
         <w:t xml:space="preserve">To design and implement a simple and low-cost IoT-based home automation system. </w:t>
       </w:r>
-      <w:r>
-        <w:rPr>
-          <w:rFonts w:ascii="Segoe UI Symbol" w:eastAsia="Segoe UI Symbol" w:hAnsi="Segoe UI Symbol" w:cs="Segoe UI Symbol"/>
-          <w:sz w:val="20"/>
-        </w:rPr>
-        <w:t></w:t>
-      </w:r>
-      <w:r>
-        <w:rPr>
-          <w:rFonts w:ascii="Arial" w:eastAsia="Arial" w:hAnsi="Arial" w:cs="Arial"/>
-          <w:sz w:val="20"/>
-        </w:rPr>
-        <w:t xml:space="preserve"> </w:t>
-      </w:r>
-      <w:r>
-        <w:rPr>
-          <w:rFonts w:ascii="Arial" w:eastAsia="Arial" w:hAnsi="Arial" w:cs="Arial"/>
-          <w:sz w:val="20"/>
-        </w:rPr>
-        <w:tab/>
-      </w:r>
+    </w:p>
+    <w:p>
+      <w:pPr>
+        <w:numPr>
+          <w:ilvl w:val="1"/>
+          <w:numId w:val="3"/>
+        </w:numPr>
+        <w:ind w:right="53" w:hanging="360"/>
+      </w:pPr>
       <w:r>
         <w:t xml:space="preserve">To remotely control home appliances using a smartphone via the Blynk IoT platform. </w:t>
       </w:r>
@@ -702,7 +658,6 @@
         <w:ind w:left="730" w:right="53"/>
       </w:pPr>
       <w:r>
-        <w:lastRenderedPageBreak/>
         <w:t xml:space="preserve">Used for manual/physical control of the loads. </w:t>
       </w:r>
     </w:p>
@@ -774,6 +729,7 @@
         <w:rPr>
           <w:b/>
         </w:rPr>
+        <w:lastRenderedPageBreak/>
         <w:t>USB Cable</w:t>
       </w:r>
       <w:r>
@@ -883,20 +839,7 @@
           <w:b/>
           <w:sz w:val="36"/>
         </w:rPr>
-        <w:t xml:space="preserve">4.CIRCUIT DESCRIPTION: </w:t>
-      </w:r>
-    </w:p>
-    <w:p>
-      <w:pPr>
-        <w:spacing w:after="0" w:line="259" w:lineRule="auto"/>
-        <w:ind w:left="720" w:firstLine="0"/>
-      </w:pPr>
-      <w:r>
-        <w:rPr>
-          <w:b/>
-          <w:sz w:val="36"/>
-        </w:rPr>
-        <w:t xml:space="preserve"> </w:t>
+        <w:t xml:space="preserve">4.CIRCUIT DESCRIPTION:  </w:t>
       </w:r>
     </w:p>
     <w:p>
@@ -904,15 +847,7 @@
         <w:ind w:left="-5" w:right="53"/>
       </w:pPr>
       <w:r>
-        <w:t xml:space="preserve">The hardware connections for the system are simple and easy to implement. Each LED and switch </w:t>
-      </w:r>
-      <w:proofErr w:type="gramStart"/>
-      <w:r>
-        <w:t>is</w:t>
-      </w:r>
-      <w:proofErr w:type="gramEnd"/>
-      <w:r>
-        <w:t xml:space="preserve"> connected to a specific GPIO pin of the ESP32: </w:t>
+        <w:t xml:space="preserve">The hardware connections for the system are simple and easy to implement. Each LED and switch is connected to a specific GPIO pin of the ESP32: </w:t>
       </w:r>
     </w:p>
     <w:p>
@@ -1123,20 +1058,7 @@
           <w:b/>
           <w:sz w:val="36"/>
         </w:rPr>
-        <w:t xml:space="preserve">5.WORKING PRINCIPLE: </w:t>
-      </w:r>
-    </w:p>
-    <w:p>
-      <w:pPr>
-        <w:spacing w:after="0" w:line="259" w:lineRule="auto"/>
-        <w:ind w:left="2497" w:firstLine="0"/>
-      </w:pPr>
-      <w:r>
-        <w:rPr>
-          <w:b/>
-          <w:sz w:val="36"/>
-        </w:rPr>
-        <w:t xml:space="preserve"> </w:t>
+        <w:t xml:space="preserve">5.WORKING PRINCIPLE:  </w:t>
       </w:r>
     </w:p>
     <w:p>
@@ -1209,7 +1131,6 @@
         <w:ind w:right="53" w:hanging="360"/>
       </w:pPr>
       <w:r>
-        <w:lastRenderedPageBreak/>
         <w:t xml:space="preserve">When a physical switch is pressed, the ESP32: </w:t>
       </w:r>
     </w:p>
@@ -1293,6 +1214,18 @@
     </w:p>
     <w:p>
       <w:pPr>
+        <w:spacing w:after="121" w:line="259" w:lineRule="auto"/>
+        <w:ind w:left="0" w:firstLine="0"/>
+      </w:pPr>
+    </w:p>
+    <w:p>
+      <w:pPr>
+        <w:spacing w:after="121" w:line="259" w:lineRule="auto"/>
+        <w:ind w:left="0" w:firstLine="0"/>
+      </w:pPr>
+    </w:p>
+    <w:p>
+      <w:pPr>
         <w:spacing w:after="0" w:line="259" w:lineRule="auto"/>
         <w:ind w:left="0" w:firstLine="0"/>
       </w:pPr>
@@ -1300,6 +1233,7 @@
         <w:rPr>
           <w:sz w:val="36"/>
         </w:rPr>
+        <w:lastRenderedPageBreak/>
         <w:t xml:space="preserve">CIRCUIT CONNECTION: </w:t>
       </w:r>
     </w:p>
@@ -1330,8 +1264,8 @@
           <w:noProof/>
         </w:rPr>
         <w:drawing>
-          <wp:inline distT="0" distB="0" distL="0" distR="0" wp14:anchorId="79439777" wp14:editId="3116B4C8">
-            <wp:extent cx="5619750" cy="2876550"/>
+          <wp:inline distT="0" distB="0" distL="0" distR="0" wp14:anchorId="79439777" wp14:editId="4C0DF5A8">
+            <wp:extent cx="5829300" cy="2876550"/>
             <wp:effectExtent l="0" t="0" r="0" b="0"/>
             <wp:docPr id="449" name="Picture 449"/>
             <wp:cNvGraphicFramePr/>
@@ -1351,7 +1285,7 @@
                   <pic:spPr>
                     <a:xfrm>
                       <a:off x="0" y="0"/>
-                      <a:ext cx="5619750" cy="2876550"/>
+                      <a:ext cx="5829300" cy="2876550"/>
                     </a:xfrm>
                     <a:prstGeom prst="rect">
                       <a:avLst/>
@@ -1384,27 +1318,17 @@
     <w:p>
       <w:pPr>
         <w:spacing w:after="0" w:line="259" w:lineRule="auto"/>
-        <w:ind w:left="0" w:firstLine="0"/>
-      </w:pPr>
-      <w:r>
-        <w:t xml:space="preserve"> </w:t>
-      </w:r>
-    </w:p>
-    <w:p>
-      <w:pPr>
-        <w:spacing w:after="0" w:line="259" w:lineRule="auto"/>
-        <w:ind w:left="-2" w:firstLine="0"/>
+        <w:ind w:left="-284" w:firstLine="0"/>
         <w:jc w:val="right"/>
       </w:pPr>
       <w:r>
         <w:rPr>
           <w:noProof/>
         </w:rPr>
-        <w:lastRenderedPageBreak/>
         <w:drawing>
-          <wp:inline distT="0" distB="0" distL="0" distR="0" wp14:anchorId="4F221C92" wp14:editId="6AAEE48E">
-            <wp:extent cx="5934076" cy="3276600"/>
-            <wp:effectExtent l="0" t="0" r="0" b="0"/>
+          <wp:inline distT="0" distB="0" distL="0" distR="0" wp14:anchorId="4F221C92" wp14:editId="5B510A32">
+            <wp:extent cx="6309360" cy="3276599"/>
+            <wp:effectExtent l="0" t="0" r="0" b="635"/>
             <wp:docPr id="447" name="Picture 447"/>
             <wp:cNvGraphicFramePr/>
             <a:graphic xmlns:a="http://schemas.openxmlformats.org/drawingml/2006/main">
@@ -1423,7 +1347,7 @@
                   <pic:spPr>
                     <a:xfrm>
                       <a:off x="0" y="0"/>
-                      <a:ext cx="5934076" cy="3276600"/>
+                      <a:ext cx="6369471" cy="3307816"/>
                     </a:xfrm>
                     <a:prstGeom prst="rect">
                       <a:avLst/>
@@ -1468,6 +1392,36 @@
     </w:p>
     <w:p>
       <w:pPr>
+        <w:spacing w:after="10" w:line="259" w:lineRule="auto"/>
+        <w:ind w:left="0" w:firstLine="0"/>
+      </w:pPr>
+    </w:p>
+    <w:p>
+      <w:pPr>
+        <w:spacing w:after="10" w:line="259" w:lineRule="auto"/>
+        <w:ind w:left="0" w:firstLine="0"/>
+      </w:pPr>
+    </w:p>
+    <w:p>
+      <w:pPr>
+        <w:spacing w:after="10" w:line="259" w:lineRule="auto"/>
+        <w:ind w:left="0" w:firstLine="0"/>
+      </w:pPr>
+    </w:p>
+    <w:p>
+      <w:pPr>
+        <w:spacing w:after="10" w:line="259" w:lineRule="auto"/>
+        <w:ind w:left="0" w:firstLine="0"/>
+      </w:pPr>
+    </w:p>
+    <w:p>
+      <w:pPr>
+        <w:spacing w:after="10" w:line="259" w:lineRule="auto"/>
+        <w:ind w:left="0" w:firstLine="0"/>
+      </w:pPr>
+    </w:p>
+    <w:p>
+      <w:pPr>
         <w:spacing w:after="0" w:line="259" w:lineRule="auto"/>
         <w:ind w:left="0" w:firstLine="0"/>
       </w:pPr>
@@ -1485,6 +1439,7 @@
           <w:b/>
           <w:sz w:val="36"/>
         </w:rPr>
+        <w:lastRenderedPageBreak/>
         <w:t xml:space="preserve">6.ARDUINO CODE USED IN THE PROJECT: </w:t>
       </w:r>
     </w:p>
@@ -1724,7 +1679,6 @@
         <w:ind w:left="-5" w:right="7358"/>
       </w:pPr>
       <w:r>
-        <w:lastRenderedPageBreak/>
         <w:t xml:space="preserve">int led1_state = 0; int led2_state = 0; </w:t>
       </w:r>
     </w:p>
@@ -2015,6 +1969,7 @@
       </w:r>
       <w:proofErr w:type="spellStart"/>
       <w:r>
+        <w:lastRenderedPageBreak/>
         <w:t>pinMode</w:t>
       </w:r>
       <w:proofErr w:type="spellEnd"/>
@@ -2202,20 +2157,7 @@
           <w:b/>
           <w:sz w:val="36"/>
         </w:rPr>
-        <w:t xml:space="preserve">7.OUTPUT: </w:t>
-      </w:r>
-    </w:p>
-    <w:p>
-      <w:pPr>
-        <w:spacing w:after="0" w:line="259" w:lineRule="auto"/>
-        <w:ind w:left="720" w:firstLine="0"/>
-      </w:pPr>
-      <w:r>
-        <w:rPr>
-          <w:b/>
-          <w:sz w:val="36"/>
-        </w:rPr>
-        <w:t xml:space="preserve"> </w:t>
+        <w:t xml:space="preserve">7.OUTPUT:  </w:t>
       </w:r>
     </w:p>
     <w:p>
@@ -2259,7 +2201,6 @@
         <w:ind w:right="53" w:hanging="360"/>
       </w:pPr>
       <w:r>
-        <w:lastRenderedPageBreak/>
         <w:t xml:space="preserve">The physical switches can also control the LEDs manually. </w:t>
       </w:r>
     </w:p>
@@ -2311,27 +2252,8 @@
         <w:ind w:left="0" w:firstLine="0"/>
       </w:pPr>
       <w:r>
-        <w:t xml:space="preserve"> </w:t>
-      </w:r>
-    </w:p>
-    <w:p>
-      <w:pPr>
-        <w:spacing w:after="10" w:line="259" w:lineRule="auto"/>
-        <w:ind w:left="-5"/>
-      </w:pPr>
-      <w:r>
-        <w:rPr>
-          <w:b/>
-          <w:sz w:val="36"/>
-        </w:rPr>
-        <w:t xml:space="preserve">8.APPLICATIONS: </w:t>
-      </w:r>
-    </w:p>
-    <w:p>
-      <w:pPr>
-        <w:spacing w:after="0" w:line="259" w:lineRule="auto"/>
-        <w:ind w:left="720" w:firstLine="0"/>
-      </w:pPr>
+        <w:t xml:space="preserve">  </w:t>
+      </w:r>
       <w:r>
         <w:rPr>
           <w:b/>
@@ -2342,10 +2264,15 @@
     </w:p>
     <w:p>
       <w:pPr>
-        <w:ind w:left="-5" w:right="53"/>
-      </w:pPr>
-      <w:r>
-        <w:t xml:space="preserve">This system can be used in several real-world applications: </w:t>
+        <w:spacing w:after="10" w:line="259" w:lineRule="auto"/>
+        <w:ind w:left="370"/>
+      </w:pPr>
+      <w:r>
+        <w:rPr>
+          <w:b/>
+          <w:sz w:val="36"/>
+        </w:rPr>
+        <w:t xml:space="preserve">9.ADVANTAGES: </w:t>
       </w:r>
     </w:p>
     <w:p>
@@ -2357,7 +2284,7 @@
         <w:ind w:right="53" w:hanging="360"/>
       </w:pPr>
       <w:r>
-        <w:t xml:space="preserve">Smart home lighting systems </w:t>
+        <w:t xml:space="preserve">Easy to implement </w:t>
       </w:r>
     </w:p>
     <w:p>
@@ -2369,7 +2296,7 @@
         <w:ind w:right="53" w:hanging="360"/>
       </w:pPr>
       <w:r>
-        <w:t xml:space="preserve">Remote control of fans, lights, and appliances </w:t>
+        <w:t xml:space="preserve">Low cost </w:t>
       </w:r>
     </w:p>
     <w:p>
@@ -2381,7 +2308,7 @@
         <w:ind w:right="53" w:hanging="360"/>
       </w:pPr>
       <w:r>
-        <w:t xml:space="preserve">Energy-efficient automation </w:t>
+        <w:t xml:space="preserve">Wi-Fi-based real-time control </w:t>
       </w:r>
     </w:p>
     <w:p>
@@ -2393,7 +2320,7 @@
         <w:ind w:right="53" w:hanging="360"/>
       </w:pPr>
       <w:r>
-        <w:t xml:space="preserve">College and school IoT demonstration projects </w:t>
+        <w:t xml:space="preserve">Dual control: physical + mobile app </w:t>
       </w:r>
     </w:p>
     <w:p>
@@ -2405,7 +2332,7 @@
         <w:ind w:right="53" w:hanging="360"/>
       </w:pPr>
       <w:r>
-        <w:t xml:space="preserve">Office automation </w:t>
+        <w:t xml:space="preserve">Can be expanded to 4, 8, or 16 appliances </w:t>
       </w:r>
     </w:p>
     <w:p>
@@ -2417,7 +2344,7 @@
         <w:ind w:right="53" w:hanging="360"/>
       </w:pPr>
       <w:r>
-        <w:t xml:space="preserve">Smart classroom or laboratory control </w:t>
+        <w:t xml:space="preserve">Cloud-based monitoring </w:t>
       </w:r>
     </w:p>
     <w:p>
@@ -2429,7 +2356,7 @@
         <w:ind w:right="53" w:hanging="360"/>
       </w:pPr>
       <w:r>
-        <w:t xml:space="preserve">Automation for disabled or elderly people </w:t>
+        <w:t xml:space="preserve">Safe low-voltage demonstration </w:t>
       </w:r>
     </w:p>
     <w:p>
@@ -2441,16 +2368,7 @@
         <w:ind w:right="53" w:hanging="360"/>
       </w:pPr>
       <w:r>
-        <w:t xml:space="preserve">IoT-based hostel or hotel room management </w:t>
-      </w:r>
-    </w:p>
-    <w:p>
-      <w:pPr>
-        <w:spacing w:after="6" w:line="259" w:lineRule="auto"/>
-        <w:ind w:left="0" w:firstLine="0"/>
-      </w:pPr>
-      <w:r>
-        <w:t xml:space="preserve"> </w:t>
+        <w:t xml:space="preserve">Highly reliable for home use </w:t>
       </w:r>
     </w:p>
     <w:p>
@@ -2459,199 +2377,25 @@
         <w:ind w:left="0" w:firstLine="0"/>
       </w:pPr>
       <w:r>
-        <w:rPr>
-          <w:b/>
-        </w:rPr>
         <w:t xml:space="preserve"> </w:t>
       </w:r>
     </w:p>
     <w:p>
       <w:pPr>
-        <w:spacing w:after="15" w:line="259" w:lineRule="auto"/>
-        <w:ind w:left="360" w:firstLine="0"/>
+        <w:spacing w:after="10" w:line="259" w:lineRule="auto"/>
+        <w:ind w:left="370" w:hanging="370"/>
       </w:pPr>
       <w:r>
         <w:rPr>
           <w:b/>
           <w:sz w:val="36"/>
         </w:rPr>
-        <w:t xml:space="preserve"> </w:t>
-      </w:r>
-    </w:p>
-    <w:p>
-      <w:pPr>
-        <w:spacing w:after="0" w:line="259" w:lineRule="auto"/>
-        <w:ind w:left="360" w:firstLine="0"/>
-      </w:pPr>
-      <w:r>
-        <w:rPr>
-          <w:b/>
-          <w:sz w:val="36"/>
-        </w:rPr>
-        <w:t xml:space="preserve"> </w:t>
-      </w:r>
-    </w:p>
-    <w:p>
-      <w:pPr>
-        <w:spacing w:after="10" w:line="259" w:lineRule="auto"/>
-        <w:ind w:left="370"/>
-      </w:pPr>
-      <w:r>
-        <w:rPr>
-          <w:b/>
-          <w:sz w:val="36"/>
-        </w:rPr>
-        <w:t xml:space="preserve">9.ADVANTAGES: </w:t>
-      </w:r>
-    </w:p>
-    <w:p>
-      <w:pPr>
-        <w:spacing w:after="0" w:line="259" w:lineRule="auto"/>
-        <w:ind w:left="720" w:firstLine="0"/>
-      </w:pPr>
-      <w:r>
-        <w:rPr>
-          <w:b/>
-          <w:sz w:val="36"/>
-        </w:rPr>
-        <w:t xml:space="preserve"> </w:t>
-      </w:r>
-    </w:p>
-    <w:p>
-      <w:pPr>
-        <w:numPr>
-          <w:ilvl w:val="0"/>
-          <w:numId w:val="7"/>
-        </w:numPr>
-        <w:ind w:right="53" w:hanging="360"/>
-      </w:pPr>
-      <w:r>
-        <w:t xml:space="preserve">Easy to implement </w:t>
-      </w:r>
-    </w:p>
-    <w:p>
-      <w:pPr>
-        <w:numPr>
-          <w:ilvl w:val="0"/>
-          <w:numId w:val="7"/>
-        </w:numPr>
-        <w:ind w:right="53" w:hanging="360"/>
-      </w:pPr>
-      <w:r>
-        <w:t xml:space="preserve">Low cost </w:t>
-      </w:r>
-    </w:p>
-    <w:p>
-      <w:pPr>
-        <w:numPr>
-          <w:ilvl w:val="0"/>
-          <w:numId w:val="7"/>
-        </w:numPr>
-        <w:ind w:right="53" w:hanging="360"/>
-      </w:pPr>
-      <w:r>
-        <w:t xml:space="preserve">Wi-Fi-based real-time control </w:t>
-      </w:r>
-    </w:p>
-    <w:p>
-      <w:pPr>
-        <w:numPr>
-          <w:ilvl w:val="0"/>
-          <w:numId w:val="7"/>
-        </w:numPr>
-        <w:ind w:right="53" w:hanging="360"/>
-      </w:pPr>
-      <w:r>
-        <w:t xml:space="preserve">Dual control: physical + mobile app </w:t>
-      </w:r>
-    </w:p>
-    <w:p>
-      <w:pPr>
-        <w:numPr>
-          <w:ilvl w:val="0"/>
-          <w:numId w:val="7"/>
-        </w:numPr>
-        <w:ind w:right="53" w:hanging="360"/>
-      </w:pPr>
-      <w:r>
-        <w:t xml:space="preserve">Can be expanded to 4, 8, or 16 appliances </w:t>
-      </w:r>
-    </w:p>
-    <w:p>
-      <w:pPr>
-        <w:numPr>
-          <w:ilvl w:val="0"/>
-          <w:numId w:val="7"/>
-        </w:numPr>
-        <w:ind w:right="53" w:hanging="360"/>
-      </w:pPr>
-      <w:r>
-        <w:t xml:space="preserve">Cloud-based monitoring </w:t>
-      </w:r>
-    </w:p>
-    <w:p>
-      <w:pPr>
-        <w:numPr>
-          <w:ilvl w:val="0"/>
-          <w:numId w:val="7"/>
-        </w:numPr>
-        <w:ind w:right="53" w:hanging="360"/>
-      </w:pPr>
-      <w:r>
-        <w:t xml:space="preserve">Safe low-voltage demonstration </w:t>
-      </w:r>
-    </w:p>
-    <w:p>
-      <w:pPr>
-        <w:numPr>
-          <w:ilvl w:val="0"/>
-          <w:numId w:val="7"/>
-        </w:numPr>
-        <w:ind w:right="53" w:hanging="360"/>
-      </w:pPr>
-      <w:r>
-        <w:t xml:space="preserve">Highly reliable for home use </w:t>
-      </w:r>
-    </w:p>
-    <w:p>
-      <w:pPr>
-        <w:spacing w:after="116" w:line="259" w:lineRule="auto"/>
-        <w:ind w:left="0" w:firstLine="0"/>
-      </w:pPr>
-      <w:r>
-        <w:t xml:space="preserve"> </w:t>
-      </w:r>
-    </w:p>
-    <w:p>
-      <w:pPr>
-        <w:spacing w:after="10" w:line="259" w:lineRule="auto"/>
-        <w:ind w:left="370"/>
-      </w:pPr>
-      <w:r>
-        <w:rPr>
-          <w:b/>
-          <w:sz w:val="36"/>
-        </w:rPr>
-        <w:t xml:space="preserve">10.CONCLUSION: </w:t>
-      </w:r>
-    </w:p>
-    <w:p>
-      <w:pPr>
-        <w:spacing w:after="0" w:line="259" w:lineRule="auto"/>
-        <w:ind w:left="720" w:firstLine="0"/>
-      </w:pPr>
-      <w:r>
-        <w:rPr>
-          <w:b/>
-          <w:sz w:val="36"/>
-        </w:rPr>
-        <w:t xml:space="preserve"> </w:t>
-      </w:r>
-    </w:p>
-    <w:p>
-      <w:pPr>
-        <w:spacing w:after="6"/>
-        <w:ind w:left="10"/>
+        <w:t xml:space="preserve">10.CONCLUSION:  </w:t>
+      </w:r>
+    </w:p>
+    <w:p>
+      <w:pPr>
+        <w:ind w:left="284" w:right="168" w:firstLine="0"/>
       </w:pPr>
       <w:r>
         <w:t xml:space="preserve">This project successfully demonstrates a working </w:t>
@@ -2663,15 +2407,13 @@
         <w:t>IoT-based home automation system using ESP32 and Blynk IoT</w:t>
       </w:r>
       <w:r>
-        <w:t xml:space="preserve">. </w:t>
-      </w:r>
-    </w:p>
-    <w:p>
-      <w:pPr>
-        <w:ind w:left="-5" w:right="168"/>
-      </w:pPr>
-      <w:r>
-        <w:t xml:space="preserve">It allows users to control devices both manually and remotely, offering convenience, safety, and modern automation capability. The ESP32 microcontroller, combined with Blynk, provides a cost-effective and scalable solution for implementing automation in homes and offices. The project serves as a foundation for more advanced systems, such as sensor-based automation, voice control, scheduling, or integrating real AC appliances through relays. </w:t>
+        <w:t>.</w:t>
+      </w:r>
+      <w:r>
+        <w:t xml:space="preserve"> </w:t>
+      </w:r>
+      <w:r>
+        <w:t>It allows users to control devices both manually and remotely, offering convenience, safety, and modern automation capability. The ESP32 microcontroller, combined with Blynk, provides a cost-effective and scalable solution for implementing automation in homes and offices. The project serves as a foundation for more advanced systems, such as sensor-based automation, voice control, scheduling, or integrating real AC appliances through relays.</w:t>
       </w:r>
     </w:p>
     <w:p>
@@ -2679,25 +2421,12 @@
         <w:spacing w:after="7" w:line="259" w:lineRule="auto"/>
         <w:ind w:left="0" w:firstLine="0"/>
       </w:pPr>
-      <w:r>
-        <w:rPr>
-          <w:sz w:val="22"/>
-        </w:rPr>
-        <w:t xml:space="preserve"> </w:t>
-      </w:r>
     </w:p>
     <w:p>
       <w:pPr>
         <w:spacing w:after="0" w:line="259" w:lineRule="auto"/>
         <w:ind w:left="0" w:firstLine="0"/>
       </w:pPr>
-      <w:r>
-        <w:rPr>
-          <w:sz w:val="22"/>
-        </w:rPr>
-        <w:lastRenderedPageBreak/>
-        <w:t xml:space="preserve"> </w:t>
-      </w:r>
     </w:p>
     <w:sectPr>
       <w:headerReference w:type="even" r:id="rId10"/>
@@ -2707,7 +2436,7 @@
       <w:headerReference w:type="first" r:id="rId14"/>
       <w:footerReference w:type="first" r:id="rId15"/>
       <w:pgSz w:w="11899" w:h="16838"/>
-      <w:pgMar w:top="1312" w:right="1516" w:bottom="1366" w:left="965" w:header="480" w:footer="475" w:gutter="0"/>
+      <w:pgMar w:top="851" w:right="842" w:bottom="993" w:left="993" w:header="480" w:footer="475" w:gutter="0"/>
       <w:cols w:space="720"/>
     </w:sectPr>
   </w:body>
@@ -6578,6 +6307,27 @@
       <w:color w:val="000000"/>
     </w:rPr>
   </w:style>
+  <w:style w:type="paragraph" w:styleId="Heading1">
+    <w:name w:val="heading 1"/>
+    <w:basedOn w:val="Normal"/>
+    <w:next w:val="Normal"/>
+    <w:link w:val="Heading1Char"/>
+    <w:uiPriority w:val="9"/>
+    <w:qFormat/>
+    <w:rsid w:val="00163653"/>
+    <w:pPr>
+      <w:keepNext/>
+      <w:keepLines/>
+      <w:spacing w:before="240" w:after="0"/>
+      <w:outlineLvl w:val="0"/>
+    </w:pPr>
+    <w:rPr>
+      <w:rFonts w:asciiTheme="majorHAnsi" w:eastAsiaTheme="majorEastAsia" w:hAnsiTheme="majorHAnsi" w:cstheme="majorBidi"/>
+      <w:color w:val="0F4761" w:themeColor="accent1" w:themeShade="BF"/>
+      <w:sz w:val="32"/>
+      <w:szCs w:val="32"/>
+    </w:rPr>
+  </w:style>
   <w:style w:type="character" w:default="1" w:styleId="DefaultParagraphFont">
     <w:name w:val="Default Paragraph Font"/>
     <w:uiPriority w:val="1"/>
@@ -6604,6 +6354,19 @@
     <w:uiPriority w:val="99"/>
     <w:semiHidden/>
     <w:unhideWhenUsed/>
+  </w:style>
+  <w:style w:type="character" w:customStyle="1" w:styleId="Heading1Char">
+    <w:name w:val="Heading 1 Char"/>
+    <w:basedOn w:val="DefaultParagraphFont"/>
+    <w:link w:val="Heading1"/>
+    <w:uiPriority w:val="9"/>
+    <w:rsid w:val="00163653"/>
+    <w:rPr>
+      <w:rFonts w:asciiTheme="majorHAnsi" w:eastAsiaTheme="majorEastAsia" w:hAnsiTheme="majorHAnsi" w:cstheme="majorBidi"/>
+      <w:color w:val="0F4761" w:themeColor="accent1" w:themeShade="BF"/>
+      <w:sz w:val="32"/>
+      <w:szCs w:val="32"/>
+    </w:rPr>
   </w:style>
 </w:styles>
 </file>

</xml_diff>